<commit_message>
Fix Section 5 Tech Portfolio 2x2 label collisions with multi-directional offsets
Two dots literally overlap at (9,8): Cybersecurity and ML Credit Scoring.
Previous fix had both labels stacked vertically which still collided.

New layout uses 4 different label directions:
- Cybersecurity (9,8): far ABOVE (+32) with ha=center
- ML Credit Scoring (9,8): LEFT (-55, +14) with ha=right — points left
- Cloud/Data Platform (9,7): RIGHT (+55, 0) with ha=left — points right
- GenAI Back-office (8,9): below (-16)
- RPA (7,9): RIGHT (+55, 0) with ha=left — points right

Extended xlim to 11, ylim to 10.8. Moved quadrant headers to corners
(INVEST NOW top-right, STRATEGIC BETS top-left) to avoid collisions.
Added zorder=5 so labels render on top of dots.

https://claude.ai/code/session_011F2ZpxHnuQ8BtRbwuEkG6H
</commit_message>
<xml_diff>
--- a/PLMA_Tech_Strategy_2026.docx
+++ b/PLMA_Tech_Strategy_2026.docx
@@ -4552,7 +4552,7 @@
       <w:r>
         <w:drawing>
           <wp:inline xmlns:a="http://schemas.openxmlformats.org/drawingml/2006/main" xmlns:pic="http://schemas.openxmlformats.org/drawingml/2006/picture">
-            <wp:extent cx="5943600" cy="4570523"/>
+            <wp:extent cx="5943600" cy="4615259"/>
             <wp:docPr id="8" name="Picture 8"/>
             <wp:cNvGraphicFramePr>
               <a:graphicFrameLocks noChangeAspect="1"/>
@@ -4573,7 +4573,7 @@
                   <pic:spPr>
                     <a:xfrm>
                       <a:off x="0" y="0"/>
-                      <a:ext cx="5943600" cy="4570523"/>
+                      <a:ext cx="5943600" cy="4615259"/>
                     </a:xfrm>
                     <a:prstGeom prst="rect"/>
                   </pic:spPr>

</xml_diff>